<commit_message>
feat(content): the inputs hash lists each input, and a stale check names them (T2)
documents/inputs.sha256 now holds one line per input in sha256sum form,
sorted by name, instead of one digest over the lines. A locked package is
named bun.lock#<package>. `shasum -a 256 -c --ignore-missing` checks the
files from the repo root, and a git diff shows which input moved.

The documents test compares the two lists and names each input that
changed, beside the command to run. SPEC-content states the format.

Are you pondering what I am pondering? — 🧠
</commit_message>
<xml_diff>
--- a/documents/Peter-Kloss-Resume.docx
+++ b/documents/Peter-Kloss-Resume.docx
@@ -48,7 +48,7 @@
         </w:rPr>
         <w:t xml:space="preserve">   </w:t>
       </w:r>
-      <w:hyperlink w:history="1" r:id="rId3mkcsarq87ywc2bj5oznw">
+      <w:hyperlink w:history="1" r:id="rIdypdbv4edhzwjgrfhjhycy">
         <w:r>
           <w:rPr>
             <w:color w:val="5F6368"/>
@@ -66,7 +66,7 @@
           <w:szCs w:val="18"/>
         </w:rPr>
       </w:pPr>
-      <w:hyperlink w:history="1" r:id="rIdaewkxq6oguri6ouadbf5d">
+      <w:hyperlink w:history="1" r:id="rIddhda0jgye4tovrfpvyavy">
         <w:r>
           <w:rPr>
             <w:color w:val="5F6368"/>
@@ -81,7 +81,7 @@
         </w:rPr>
         <w:t xml:space="preserve">   </w:t>
       </w:r>
-      <w:hyperlink w:history="1" r:id="rIdj5sw-6zectwbzt5ivz80d">
+      <w:hyperlink w:history="1" r:id="rId4ip-z1u-px5fuom3a9nqc">
         <w:r>
           <w:rPr>
             <w:color w:val="5F6368"/>

</xml_diff>

<commit_message>
feat(content): bun run documents says why it rebuilt, with tests for a second run and a missing document (T2)
updateDocuments(dir) holds the command's decision: it rebuilds when an
input changed or a document is missing, returns both lists, and
otherwise writes nothing. The main block only prints the result, and the
build-and-copy step is its own function.

Three tests run it on a temporary folder: an empty folder gets the
documents and the inputs hash, a second run writes nothing, and a missing
document is rebuilt. A mutation that always rebuilds, and one that
ignores a missing document, each fail their test.

Review fixes: the code uses the glossary's "inputs hash" for the file,
one function reads the committed inputs hash, the dotfile comment sits
beside the input list, and inputsHash() drops its unused root parameter.

Are you pondering what I am pondering? — 🧠
</commit_message>
<xml_diff>
--- a/documents/Peter-Kloss-Resume.docx
+++ b/documents/Peter-Kloss-Resume.docx
@@ -48,7 +48,7 @@
         </w:rPr>
         <w:t xml:space="preserve">   </w:t>
       </w:r>
-      <w:hyperlink w:history="1" r:id="rIdypdbv4edhzwjgrfhjhycy">
+      <w:hyperlink w:history="1" r:id="rIdknmmtl99w3ck-bclv15bp">
         <w:r>
           <w:rPr>
             <w:color w:val="5F6368"/>
@@ -66,7 +66,7 @@
           <w:szCs w:val="18"/>
         </w:rPr>
       </w:pPr>
-      <w:hyperlink w:history="1" r:id="rIddhda0jgye4tovrfpvyavy">
+      <w:hyperlink w:history="1" r:id="rIdvbj3zarrkyiogqlvqcpzd">
         <w:r>
           <w:rPr>
             <w:color w:val="5F6368"/>
@@ -81,7 +81,7 @@
         </w:rPr>
         <w:t xml:space="preserve">   </w:t>
       </w:r>
-      <w:hyperlink w:history="1" r:id="rId4ip-z1u-px5fuom3a9nqc">
+      <w:hyperlink w:history="1" r:id="rId6yfb421xm91gvutlbcn2j">
         <w:r>
           <w:rPr>
             <w:color w:val="5F6368"/>

</xml_diff>

<commit_message>
test(content): the inputs hash covers every file and package the document build reaches (T2)
A test walks the imports from scripts/documents.ts with Bun.Transpiler's
scanImports and Bun.resolveSync, and follows each
`new URL("./…", import.meta.url)`, the way the print template reads its
CSS and script. It fails, and names the gap, when a reached file is not an
input or a reached package is not in LOCKED_PACKAGES. The hand list can
no longer drift from what the build reads.

A mutation that drops src/export/** and one that drops zod each fail it.
scripts/documents.ts exports inputFiles() and LOCKED_PACKAGES for the test.

Are you pondering what I am pondering? — 🧠
</commit_message>
<xml_diff>
--- a/documents/Peter-Kloss-Resume.docx
+++ b/documents/Peter-Kloss-Resume.docx
@@ -48,7 +48,7 @@
         </w:rPr>
         <w:t xml:space="preserve">   </w:t>
       </w:r>
-      <w:hyperlink w:history="1" r:id="rIdknmmtl99w3ck-bclv15bp">
+      <w:hyperlink w:history="1" r:id="rId10aa6yjse-1gwphpivh54">
         <w:r>
           <w:rPr>
             <w:color w:val="5F6368"/>
@@ -66,7 +66,7 @@
           <w:szCs w:val="18"/>
         </w:rPr>
       </w:pPr>
-      <w:hyperlink w:history="1" r:id="rIdvbj3zarrkyiogqlvqcpzd">
+      <w:hyperlink w:history="1" r:id="rIduzmajte3icrrbmthgy3tj">
         <w:r>
           <w:rPr>
             <w:color w:val="5F6368"/>
@@ -81,7 +81,7 @@
         </w:rPr>
         <w:t xml:space="preserve">   </w:t>
       </w:r>
-      <w:hyperlink w:history="1" r:id="rId6yfb421xm91gvutlbcn2j">
+      <w:hyperlink w:history="1" r:id="rIdd2vkjplwwbypdi_dteb1q">
         <w:r>
           <w:rPr>
             <w:color w:val="5F6368"/>

</xml_diff>

<commit_message>
feat(content): each role has its short label, x-short (T1)
Each of the nine roles in resume.yaml holds x-short, the label the career
timeline shows, with the values of the "Career timeline states" board. The
schema requires the field, so a role without it stops the build and the
message names resume.yaml and work[n]["x-short"].

The renderer tests give each role a label that appears nowhere else and check
that renderText, renderPrintHtml and renderDocx print none of them (seam 2).
The text file's snapshot does not change (seam 1). The rebuilt documents keep
their text; only the inputs hash and the build stamps change.

The wording draft docs/design/wording-drafts/T1.md lists the nine values for
Peter's review, with the curly apostrophe in "Brigham and Women’s".

Are you pondering what I am pondering? — 🧠
</commit_message>
<xml_diff>
--- a/documents/Peter-Kloss-Resume.docx
+++ b/documents/Peter-Kloss-Resume.docx
@@ -48,7 +48,7 @@
         </w:rPr>
         <w:t xml:space="preserve">   </w:t>
       </w:r>
-      <w:hyperlink w:history="1" r:id="rIdbdt4dulygg2xcif17mn-r">
+      <w:hyperlink w:history="1" r:id="rIdwitjzdolyp1g7td3_ywul">
         <w:r>
           <w:rPr>
             <w:color w:val="5F6368"/>
@@ -66,7 +66,7 @@
           <w:szCs w:val="18"/>
         </w:rPr>
       </w:pPr>
-      <w:hyperlink w:history="1" r:id="rId-wnxwtjhxqoc_oh-dfry5">
+      <w:hyperlink w:history="1" r:id="rIdpilgitmocd9dufj-ipppq">
         <w:r>
           <w:rPr>
             <w:color w:val="5F6368"/>
@@ -81,7 +81,7 @@
         </w:rPr>
         <w:t xml:space="preserve">   </w:t>
       </w:r>
-      <w:hyperlink w:history="1" r:id="rIdzclaej8dwxnyv0keeztzu">
+      <w:hyperlink w:history="1" r:id="rIdluv8vq42t34vevboyczzz">
         <w:r>
           <w:rPr>
             <w:color w:val="5F6368"/>

</xml_diff>